<commit_message>
slight update to next steps doc template
</commit_message>
<xml_diff>
--- a/docassemble/VTCertificateOfServiceGeneral/data/templates/general_certificate_of_service_next_steps.docx
+++ b/docassemble/VTCertificateOfServiceGeneral/data/templates/general_certificate_of_service_next_steps.docx
@@ -10,16 +10,8 @@
         <w:rPr>
           <w:rStyle w:val="Heading1Char"/>
         </w:rPr>
-        <w:t xml:space="preserve">NEXT STEPS — </w:t>
-      </w:r>
-      <w:proofErr w:type="spellStart"/>
-      <w:r>
-        <w:rPr>
-          <w:rStyle w:val="Heading1Char"/>
-        </w:rPr>
-        <w:t>VTCourtForms</w:t>
-      </w:r>
-      <w:proofErr w:type="spellEnd"/>
+        <w:t>NEXT STEPS — VTCourtForms</w:t>
+      </w:r>
       <w:r>
         <w:br/>
       </w:r>
@@ -81,12 +73,6 @@
         <w:pStyle w:val="Heading2"/>
       </w:pPr>
       <w:r>
-        <w:t>Next step</w:t>
-      </w:r>
-      <w:r>
-        <w:t xml:space="preserve"> – </w:t>
-      </w:r>
-      <w:r>
         <w:t>S</w:t>
       </w:r>
       <w:r>
@@ -233,13 +219,12 @@
     </w:p>
     <w:p>
       <w:pPr>
-        <w:pStyle w:val="Heading2"/>
-      </w:pPr>
-      <w:r>
-        <w:t>Court information</w:t>
-      </w:r>
-    </w:p>
-    <w:p>
+        <w:pStyle w:val="ListParagraph"/>
+        <w:numPr>
+          <w:ilvl w:val="0"/>
+          <w:numId w:val="16"/>
+        </w:numPr>
+      </w:pPr>
       <w:r>
         <w:t>D</w:t>
       </w:r>
@@ -275,17 +260,15 @@
           <w:b/>
           <w:bCs/>
         </w:rPr>
-        <w:t xml:space="preserve"> </w:t>
-      </w:r>
-      <w:proofErr w:type="spellStart"/>
+        <w:t xml:space="preserve"> address_county </w:t>
+      </w:r>
       <w:r>
         <w:rPr>
           <w:b/>
           <w:bCs/>
         </w:rPr>
-        <w:t>address_county</w:t>
-      </w:r>
-      <w:proofErr w:type="spellEnd"/>
+        <w:t>}}</w:t>
+      </w:r>
       <w:r>
         <w:rPr>
           <w:b/>
@@ -298,14 +281,28 @@
           <w:b/>
           <w:bCs/>
         </w:rPr>
-        <w:t>}}</w:t>
+        <w:t>{{</w:t>
       </w:r>
       <w:r>
         <w:rPr>
           <w:b/>
           <w:bCs/>
         </w:rPr>
-        <w:t xml:space="preserve"> </w:t>
+        <w:t xml:space="preserve"> division </w:t>
+      </w:r>
+      <w:r>
+        <w:rPr>
+          <w:b/>
+          <w:bCs/>
+        </w:rPr>
+        <w:t>}}</w:t>
+      </w:r>
+      <w:r>
+        <w:rPr>
+          <w:b/>
+          <w:bCs/>
+        </w:rPr>
+        <w:br/>
       </w:r>
       <w:r>
         <w:rPr>
@@ -319,7 +316,7 @@
           <w:b/>
           <w:bCs/>
         </w:rPr>
-        <w:t xml:space="preserve"> division </w:t>
+        <w:t xml:space="preserve"> name </w:t>
       </w:r>
       <w:r>
         <w:rPr>
@@ -329,94 +326,18 @@
         <w:t>}}</w:t>
       </w:r>
       <w:r>
-        <w:rPr>
-          <w:b/>
-          <w:bCs/>
-        </w:rPr>
         <w:br/>
       </w:r>
       <w:r>
-        <w:rPr>
-          <w:b/>
-          <w:bCs/>
-        </w:rPr>
-        <w:t>{{</w:t>
-      </w:r>
-      <w:r>
-        <w:rPr>
-          <w:b/>
-          <w:bCs/>
-        </w:rPr>
-        <w:t xml:space="preserve"> name </w:t>
-      </w:r>
-      <w:r>
-        <w:rPr>
-          <w:b/>
-          <w:bCs/>
-        </w:rPr>
-        <w:t>}}</w:t>
+        <w:t>{{ address_address }} {{ address_unit }}</w:t>
       </w:r>
       <w:r>
         <w:br/>
-      </w:r>
-      <w:r>
-        <w:t xml:space="preserve">{{ </w:t>
-      </w:r>
-      <w:proofErr w:type="spellStart"/>
-      <w:r>
-        <w:t>address_address</w:t>
-      </w:r>
-      <w:proofErr w:type="spellEnd"/>
-      <w:r>
-        <w:t xml:space="preserve"> }} {{ </w:t>
-      </w:r>
-      <w:proofErr w:type="spellStart"/>
-      <w:r>
-        <w:t>address_unit</w:t>
-      </w:r>
-      <w:proofErr w:type="spellEnd"/>
-      <w:r>
-        <w:t xml:space="preserve"> }}</w:t>
+        <w:t>{{ address_city }}, {{ address_state }} {{ address_zip }}</w:t>
       </w:r>
       <w:r>
         <w:br/>
-        <w:t xml:space="preserve">{{ </w:t>
-      </w:r>
-      <w:proofErr w:type="spellStart"/>
-      <w:r>
-        <w:t>address_city</w:t>
-      </w:r>
-      <w:proofErr w:type="spellEnd"/>
-      <w:r>
-        <w:t xml:space="preserve"> }}, {{ </w:t>
-      </w:r>
-      <w:proofErr w:type="spellStart"/>
-      <w:r>
-        <w:t>address_state</w:t>
-      </w:r>
-      <w:proofErr w:type="spellEnd"/>
-      <w:r>
-        <w:t xml:space="preserve"> }} {{ </w:t>
-      </w:r>
-      <w:proofErr w:type="spellStart"/>
-      <w:r>
-        <w:t>address_zip</w:t>
-      </w:r>
-      <w:proofErr w:type="spellEnd"/>
-      <w:r>
-        <w:t xml:space="preserve"> }}</w:t>
-      </w:r>
-      <w:r>
-        <w:br/>
-        <w:t xml:space="preserve">{% if </w:t>
-      </w:r>
-      <w:proofErr w:type="spellStart"/>
-      <w:r>
-        <w:t>arbitrary_attribute</w:t>
-      </w:r>
-      <w:proofErr w:type="spellEnd"/>
-      <w:r>
-        <w:t xml:space="preserve"> %}</w:t>
+        <w:t>{% if arbitrary_attribute %}</w:t>
       </w:r>
       <w:r>
         <w:br/>
@@ -424,15 +345,7 @@
       </w:r>
       <w:r>
         <w:br/>
-        <w:t xml:space="preserve">{{ </w:t>
-      </w:r>
-      <w:proofErr w:type="spellStart"/>
-      <w:r>
-        <w:t>arbitrary_attribute</w:t>
-      </w:r>
-      <w:proofErr w:type="spellEnd"/>
-      <w:r>
-        <w:t xml:space="preserve"> }}</w:t>
+        <w:t>{{ arbitrary_attribute }}</w:t>
       </w:r>
       <w:r>
         <w:br/>
@@ -524,11 +437,7 @@
         </w:numPr>
       </w:pPr>
       <w:r>
-        <w:t xml:space="preserve">To hire a lawyer, or get a reduced-fee consultation, contact the Vermont Bar Association’s Lawyer Referral </w:t>
-      </w:r>
-      <w:r>
-        <w:lastRenderedPageBreak/>
-        <w:t xml:space="preserve">Service at 1-800-639-7036 or </w:t>
+        <w:t xml:space="preserve">To hire a lawyer, or get a reduced-fee consultation, contact the Vermont Bar Association’s Lawyer Referral Service at 1-800-639-7036 or </w:t>
       </w:r>
       <w:hyperlink w:history="1">
         <w:r>
@@ -551,6 +460,7 @@
         </w:numPr>
       </w:pPr>
       <w:r>
+        <w:lastRenderedPageBreak/>
         <w:t xml:space="preserve">Look for information on the VTLawHelp.org website: </w:t>
       </w:r>
       <w:hyperlink r:id="rId15" w:history="1">
@@ -670,7 +580,6 @@
         <w:docPartUnique/>
       </w:docPartObj>
     </w:sdtPr>
-    <w:sdtEndPr/>
     <w:sdtContent>
       <w:sdt>
         <w:sdtPr>
@@ -680,7 +589,6 @@
             <w:docPartUnique/>
           </w:docPartObj>
         </w:sdtPr>
-        <w:sdtEndPr/>
         <w:sdtContent>
           <w:p>
             <w:pPr>
@@ -820,7 +728,6 @@
         <w:docPartUnique/>
       </w:docPartObj>
     </w:sdtPr>
-    <w:sdtEndPr/>
     <w:sdtContent>
       <w:sdt>
         <w:sdtPr>
@@ -830,7 +737,6 @@
             <w:docPartUnique/>
           </w:docPartObj>
         </w:sdtPr>
-        <w:sdtEndPr/>
         <w:sdtContent>
           <w:p>
             <w:pPr>

</xml_diff>